<commit_message>
fixed smt i dont remember added HR paged  congee , documents
</commit_message>
<xml_diff>
--- a/documents/templates/certificat_travail.docx
+++ b/documents/templates/certificat_travail.docx
@@ -339,36 +339,6 @@
           <w:rtl w:val="0"/>
         </w:rPr>
         <w:t xml:space="preserve">Fait à {{ville}}, le {{date_generation}}</w:t>
-      </w:r>
-    </w:p>
-    <w:p>
-      <w:pPr>
-        <w:rPr/>
-      </w:pPr>
-      <w:r>
-        <w:rPr>
-          <w:rtl w:val="0"/>
-        </w:rPr>
-      </w:r>
-    </w:p>
-    <w:p>
-      <w:pPr>
-        <w:rPr/>
-      </w:pPr>
-      <w:r>
-        <w:rPr>
-          <w:rtl w:val="0"/>
-        </w:rPr>
-      </w:r>
-    </w:p>
-    <w:p>
-      <w:pPr>
-        <w:rPr/>
-      </w:pPr>
-      <w:r>
-        <w:rPr>
-          <w:rtl w:val="0"/>
-        </w:rPr>
       </w:r>
     </w:p>
     <w:p>

</xml_diff>